<commit_message>
Show isolation of the required variable before substituting values
For every part, the derivation now: (1) states the general equation,
(2) algebraically isolates/solves for the required variable, then
(3) substitutes the numbers - going straight to the answer box without
the intermediate arithmetic simplification.

Applied to both the g = 9.80 and g = 9.81 documents. Style, formatting,
and final answers are unchanged. Example 4's height is derived as
h = -1/2 a t_up^2 so the substitution reproduces 15.9 m exactly without
re-rounding v0.
</commit_message>
<xml_diff>
--- a/Guided-Examples-Free-Fall-g9.81.docx
+++ b/Guided-Examples-Free-Fall-g9.81.docx
@@ -834,7 +834,22 @@
           <w:color w:val="222222"/>
           <w:sz w:val="22"/>
         </w:rPr>
-        <w:t xml:space="preserve">Substitute </w:t>
+        <w:t xml:space="preserve">Isolate </w:t>
+      </w:r>
+      <m:oMath>
+        <m:r>
+          <m:rPr>
+            <m:sty m:val="i"/>
+          </m:rPr>
+          <m:t xml:space="preserve">y</m:t>
+        </m:r>
+      </m:oMath>
+      <w:r>
+        <w:rPr>
+          <w:color w:val="222222"/>
+          <w:sz w:val="22"/>
+        </w:rPr>
+        <w:t xml:space="preserve">, then substitute </w:t>
       </w:r>
       <m:oMath>
         <m:sSub>
@@ -920,8 +935,8 @@
         </w:tblCellMar>
       </w:tblPr>
       <w:tblGrid>
-        <w:gridCol w:w="850"/>
-        <w:gridCol w:w="2990"/>
+        <w:gridCol w:w="500"/>
+        <w:gridCol w:w="4550"/>
       </w:tblGrid>
       <w:tr>
         <w:tc>
@@ -941,12 +956,6 @@
                 </m:rPr>
                 <m:t xml:space="preserve">y</m:t>
               </m:r>
-              <m:r>
-                <m:rPr>
-                  <m:sty m:val="p"/>
-                </m:rPr>
-                <m:t xml:space="preserve"> − 0</m:t>
-              </m:r>
             </m:oMath>
           </w:p>
         </w:tc>
@@ -965,7 +974,61 @@
                 <m:rPr>
                   <m:sty m:val="p"/>
                 </m:rPr>
-                <m:t xml:space="preserve">= 0 + </m:t>
+                <m:t xml:space="preserve">= </m:t>
+              </m:r>
+              <m:sSub>
+                <m:e>
+                  <m:r>
+                    <m:rPr>
+                      <m:sty m:val="i"/>
+                    </m:rPr>
+                    <m:t xml:space="preserve">y</m:t>
+                  </m:r>
+                </m:e>
+                <m:sub>
+                  <m:r>
+                    <m:rPr>
+                      <m:sty m:val="p"/>
+                    </m:rPr>
+                    <m:t xml:space="preserve">0</m:t>
+                  </m:r>
+                </m:sub>
+              </m:sSub>
+              <m:r>
+                <m:rPr>
+                  <m:sty m:val="p"/>
+                </m:rPr>
+                <m:t xml:space="preserve"> + </m:t>
+              </m:r>
+              <m:sSub>
+                <m:e>
+                  <m:r>
+                    <m:rPr>
+                      <m:sty m:val="i"/>
+                    </m:rPr>
+                    <m:t xml:space="preserve">v</m:t>
+                  </m:r>
+                </m:e>
+                <m:sub>
+                  <m:r>
+                    <m:rPr>
+                      <m:sty m:val="p"/>
+                    </m:rPr>
+                    <m:t xml:space="preserve">0</m:t>
+                  </m:r>
+                </m:sub>
+              </m:sSub>
+              <m:r>
+                <m:rPr>
+                  <m:sty m:val="i"/>
+                </m:rPr>
+                <m:t xml:space="preserve">t</m:t>
+              </m:r>
+              <m:r>
+                <m:rPr>
+                  <m:sty m:val="p"/>
+                </m:rPr>
+                <m:t xml:space="preserve"> + </m:t>
               </m:r>
               <m:f>
                 <m:fPr>
@@ -990,17 +1053,17 @@
               </m:f>
               <m:r>
                 <m:rPr>
-                  <m:sty m:val="p"/>
-                </m:rPr>
-                <m:t xml:space="preserve">(−9.81)</m:t>
+                  <m:sty m:val="i"/>
+                </m:rPr>
+                <m:t xml:space="preserve">a</m:t>
               </m:r>
               <m:sSup>
                 <m:e>
                   <m:r>
                     <m:rPr>
-                      <m:sty m:val="p"/>
-                    </m:rPr>
-                    <m:t xml:space="preserve">(1.90)</m:t>
+                      <m:sty m:val="i"/>
+                    </m:rPr>
+                    <m:t xml:space="preserve">t</m:t>
                   </m:r>
                 </m:e>
                 <m:sup>
@@ -1052,14 +1115,53 @@
                 <m:rPr>
                   <m:sty m:val="p"/>
                 </m:rPr>
-                <m:t xml:space="preserve">= −17.7 </m:t>
-              </m:r>
+                <m:t xml:space="preserve">= 0 + (0)(1.90) + </m:t>
+              </m:r>
+              <m:f>
+                <m:fPr>
+                  <m:type m:val="bar"/>
+                </m:fPr>
+                <m:num>
+                  <m:r>
+                    <m:rPr>
+                      <m:sty m:val="p"/>
+                    </m:rPr>
+                    <m:t xml:space="preserve">1</m:t>
+                  </m:r>
+                </m:num>
+                <m:den>
+                  <m:r>
+                    <m:rPr>
+                      <m:sty m:val="p"/>
+                    </m:rPr>
+                    <m:t xml:space="preserve">2</m:t>
+                  </m:r>
+                </m:den>
+              </m:f>
               <m:r>
                 <m:rPr>
                   <m:sty m:val="p"/>
                 </m:rPr>
-                <m:t xml:space="preserve">m</m:t>
-              </m:r>
+                <m:t xml:space="preserve">(−9.81)</m:t>
+              </m:r>
+              <m:sSup>
+                <m:e>
+                  <m:r>
+                    <m:rPr>
+                      <m:sty m:val="p"/>
+                    </m:rPr>
+                    <m:t xml:space="preserve">(1.90)</m:t>
+                  </m:r>
+                </m:e>
+                <m:sup>
+                  <m:r>
+                    <m:rPr>
+                      <m:sty m:val="p"/>
+                    </m:rPr>
+                    <m:t xml:space="preserve">2</m:t>
+                  </m:r>
+                </m:sup>
+              </m:sSup>
             </m:oMath>
           </w:p>
         </w:tc>
@@ -1354,7 +1456,7 @@
           <w:color w:val="222222"/>
           <w:sz w:val="22"/>
         </w:rPr>
-        <w:t xml:space="preserve"> (this links </w:t>
+        <w:t xml:space="preserve">, which is already solved for </w:t>
       </w:r>
       <m:oMath>
         <m:r>
@@ -1369,64 +1471,7 @@
           <w:color w:val="222222"/>
           <w:sz w:val="22"/>
         </w:rPr>
-        <w:t xml:space="preserve">, </w:t>
-      </w:r>
-      <m:oMath>
-        <m:sSub>
-          <m:e>
-            <m:r>
-              <m:rPr>
-                <m:sty m:val="i"/>
-              </m:rPr>
-              <m:t xml:space="preserve">v</m:t>
-            </m:r>
-          </m:e>
-          <m:sub>
-            <m:r>
-              <m:rPr>
-                <m:sty m:val="p"/>
-              </m:rPr>
-              <m:t xml:space="preserve">0</m:t>
-            </m:r>
-          </m:sub>
-        </m:sSub>
-      </m:oMath>
-      <w:r>
-        <w:rPr>
-          <w:color w:val="222222"/>
-          <w:sz w:val="22"/>
-        </w:rPr>
-        <w:t xml:space="preserve">, </w:t>
-      </w:r>
-      <m:oMath>
-        <m:r>
-          <m:rPr>
-            <m:sty m:val="i"/>
-          </m:rPr>
-          <m:t xml:space="preserve">a</m:t>
-        </m:r>
-      </m:oMath>
-      <w:r>
-        <w:rPr>
-          <w:color w:val="222222"/>
-          <w:sz w:val="22"/>
-        </w:rPr>
-        <w:t xml:space="preserve">, and </w:t>
-      </w:r>
-      <m:oMath>
-        <m:r>
-          <m:rPr>
-            <m:sty m:val="i"/>
-          </m:rPr>
-          <m:t xml:space="preserve">t</m:t>
-        </m:r>
-      </m:oMath>
-      <w:r>
-        <w:rPr>
-          <w:color w:val="222222"/>
-          <w:sz w:val="22"/>
-        </w:rPr>
-        <w:t xml:space="preserve"> directly).</w:t>
+        <w:t xml:space="preserve">.</w:t>
       </w:r>
     </w:p>
     <w:p>
@@ -1680,46 +1725,6 @@
                   <m:sty m:val="p"/>
                 </m:rPr>
                 <m:t xml:space="preserve">= 0 + (−9.81)(1.90)</m:t>
-              </m:r>
-            </m:oMath>
-          </w:p>
-        </w:tc>
-      </w:tr>
-      <w:tr>
-        <w:tc>
-          <w:tcPr>
-            <w:tcW w:w="0" w:type="auto"/>
-            <w:vAlign w:val="center"/>
-          </w:tcPr>
-          <w:p>
-            <w:pPr>
-              <w:spacing w:before="30" w:after="30"/>
-              <w:jc w:val="right"/>
-            </w:pPr>
-          </w:p>
-        </w:tc>
-        <w:tc>
-          <w:tcPr>
-            <w:tcW w:w="0" w:type="auto"/>
-            <w:vAlign w:val="center"/>
-          </w:tcPr>
-          <w:p>
-            <w:pPr>
-              <w:spacing w:before="30" w:after="30"/>
-              <w:jc w:val="left"/>
-            </w:pPr>
-            <m:oMath>
-              <m:r>
-                <m:rPr>
-                  <m:sty m:val="p"/>
-                </m:rPr>
-                <m:t xml:space="preserve">= −18.6 </m:t>
-              </m:r>
-              <m:r>
-                <m:rPr>
-                  <m:sty m:val="p"/>
-                </m:rPr>
-                <m:t xml:space="preserve">m/s</m:t>
               </m:r>
             </m:oMath>
           </w:p>
@@ -2567,7 +2572,7 @@
           <w:color w:val="222222"/>
           <w:sz w:val="22"/>
         </w:rPr>
-        <w:t xml:space="preserve">.</w:t>
+        <w:t xml:space="preserve"> — both are already solved for the quantity we want.</w:t>
       </w:r>
     </w:p>
     <w:p>
@@ -2988,88 +2993,6 @@
           </w:p>
         </w:tc>
       </w:tr>
-      <w:tr>
-        <w:tc>
-          <w:tcPr>
-            <w:tcW w:w="0" w:type="auto"/>
-            <w:vAlign w:val="center"/>
-          </w:tcPr>
-          <w:p>
-            <w:pPr>
-              <w:spacing w:before="30" w:after="30"/>
-              <w:jc w:val="right"/>
-            </w:pPr>
-          </w:p>
-        </w:tc>
-        <w:tc>
-          <w:tcPr>
-            <w:tcW w:w="0" w:type="auto"/>
-            <w:vAlign w:val="center"/>
-          </w:tcPr>
-          <w:p>
-            <w:pPr>
-              <w:spacing w:before="30" w:after="30"/>
-              <w:jc w:val="left"/>
-            </w:pPr>
-            <m:oMath>
-              <m:r>
-                <m:rPr>
-                  <m:sty m:val="p"/>
-                </m:rPr>
-                <m:t xml:space="preserve">= −12.0 − 11.0</m:t>
-              </m:r>
-            </m:oMath>
-          </w:p>
-        </w:tc>
-      </w:tr>
-      <w:tr>
-        <w:tc>
-          <w:tcPr>
-            <w:tcW w:w="0" w:type="auto"/>
-            <w:vAlign w:val="center"/>
-          </w:tcPr>
-          <w:p>
-            <w:pPr>
-              <w:spacing w:before="30" w:after="30"/>
-              <w:jc w:val="right"/>
-            </w:pPr>
-            <m:oMath>
-              <m:r>
-                <m:rPr>
-                  <m:sty m:val="i"/>
-                </m:rPr>
-                <m:t xml:space="preserve">y</m:t>
-              </m:r>
-            </m:oMath>
-          </w:p>
-        </w:tc>
-        <w:tc>
-          <w:tcPr>
-            <w:tcW w:w="0" w:type="auto"/>
-            <w:vAlign w:val="center"/>
-          </w:tcPr>
-          <w:p>
-            <w:pPr>
-              <w:spacing w:before="30" w:after="30"/>
-              <w:jc w:val="left"/>
-            </w:pPr>
-            <m:oMath>
-              <m:r>
-                <m:rPr>
-                  <m:sty m:val="p"/>
-                </m:rPr>
-                <m:t xml:space="preserve">= −23.0 </m:t>
-              </m:r>
-              <m:r>
-                <m:rPr>
-                  <m:sty m:val="p"/>
-                </m:rPr>
-                <m:t xml:space="preserve">m</m:t>
-              </m:r>
-            </m:oMath>
-          </w:p>
-        </w:tc>
-      </w:tr>
     </w:tbl>
     <w:p>
       <w:pPr>
@@ -3142,88 +3065,6 @@
                   <m:sty m:val="p"/>
                 </m:rPr>
                 <m:t xml:space="preserve">= −8.00 + (−9.81)(1.50)</m:t>
-              </m:r>
-            </m:oMath>
-          </w:p>
-        </w:tc>
-      </w:tr>
-      <w:tr>
-        <w:tc>
-          <w:tcPr>
-            <w:tcW w:w="0" w:type="auto"/>
-            <w:vAlign w:val="center"/>
-          </w:tcPr>
-          <w:p>
-            <w:pPr>
-              <w:spacing w:before="30" w:after="30"/>
-              <w:jc w:val="right"/>
-            </w:pPr>
-          </w:p>
-        </w:tc>
-        <w:tc>
-          <w:tcPr>
-            <w:tcW w:w="0" w:type="auto"/>
-            <w:vAlign w:val="center"/>
-          </w:tcPr>
-          <w:p>
-            <w:pPr>
-              <w:spacing w:before="30" w:after="30"/>
-              <w:jc w:val="left"/>
-            </w:pPr>
-            <m:oMath>
-              <m:r>
-                <m:rPr>
-                  <m:sty m:val="p"/>
-                </m:rPr>
-                <m:t xml:space="preserve">= −8.00 − 14.7</m:t>
-              </m:r>
-            </m:oMath>
-          </w:p>
-        </w:tc>
-      </w:tr>
-      <w:tr>
-        <w:tc>
-          <w:tcPr>
-            <w:tcW w:w="0" w:type="auto"/>
-            <w:vAlign w:val="center"/>
-          </w:tcPr>
-          <w:p>
-            <w:pPr>
-              <w:spacing w:before="30" w:after="30"/>
-              <w:jc w:val="right"/>
-            </w:pPr>
-            <m:oMath>
-              <m:r>
-                <m:rPr>
-                  <m:sty m:val="i"/>
-                </m:rPr>
-                <m:t xml:space="preserve">v</m:t>
-              </m:r>
-            </m:oMath>
-          </w:p>
-        </w:tc>
-        <w:tc>
-          <w:tcPr>
-            <w:tcW w:w="0" w:type="auto"/>
-            <w:vAlign w:val="center"/>
-          </w:tcPr>
-          <w:p>
-            <w:pPr>
-              <w:spacing w:before="30" w:after="30"/>
-              <w:jc w:val="left"/>
-            </w:pPr>
-            <m:oMath>
-              <m:r>
-                <m:rPr>
-                  <m:sty m:val="p"/>
-                </m:rPr>
-                <m:t xml:space="preserve">= −22.7 </m:t>
-              </m:r>
-              <m:r>
-                <m:rPr>
-                  <m:sty m:val="p"/>
-                </m:rPr>
-                <m:t xml:space="preserve">m/s</m:t>
               </m:r>
             </m:oMath>
           </w:p>
@@ -3725,7 +3566,22 @@
           <w:color w:val="222222"/>
           <w:sz w:val="22"/>
         </w:rPr>
-        <w:t xml:space="preserve">Substitute </w:t>
+        <w:t xml:space="preserve">Solve for </w:t>
+      </w:r>
+      <m:oMath>
+        <m:r>
+          <m:rPr>
+            <m:sty m:val="i"/>
+          </m:rPr>
+          <m:t xml:space="preserve">v</m:t>
+        </m:r>
+      </m:oMath>
+      <w:r>
+        <w:rPr>
+          <w:color w:val="222222"/>
+          <w:sz w:val="22"/>
+        </w:rPr>
+        <w:t xml:space="preserve"> (take the square root), then substitute </w:t>
       </w:r>
       <m:oMath>
         <m:sSub>
@@ -3812,7 +3668,7 @@
       </w:tblPr>
       <w:tblGrid>
         <w:gridCol w:w="500"/>
-        <w:gridCol w:w="4420"/>
+        <w:gridCol w:w="5070"/>
       </w:tblGrid>
       <w:tr>
         <w:tc>
@@ -3826,24 +3682,12 @@
               <w:jc w:val="right"/>
             </w:pPr>
             <m:oMath>
-              <m:sSup>
-                <m:e>
-                  <m:r>
-                    <m:rPr>
-                      <m:sty m:val="i"/>
-                    </m:rPr>
-                    <m:t xml:space="preserve">v</m:t>
-                  </m:r>
-                </m:e>
-                <m:sup>
-                  <m:r>
-                    <m:rPr>
-                      <m:sty m:val="p"/>
-                    </m:rPr>
-                    <m:t xml:space="preserve">2</m:t>
-                  </m:r>
-                </m:sup>
-              </m:sSup>
+              <m:r>
+                <m:rPr>
+                  <m:sty m:val="i"/>
+                </m:rPr>
+                <m:t xml:space="preserve">v</m:t>
+              </m:r>
             </m:oMath>
           </w:p>
         </w:tc>
@@ -3862,32 +3706,100 @@
                 <m:rPr>
                   <m:sty m:val="p"/>
                 </m:rPr>
-                <m:t xml:space="preserve">= </m:t>
-              </m:r>
-              <m:sSup>
+                <m:t xml:space="preserve">= ±</m:t>
+              </m:r>
+              <m:rad>
+                <m:radPr>
+                  <m:degHide m:val="1"/>
+                </m:radPr>
+                <m:deg/>
                 <m:e>
+                  <m:sSup>
+                    <m:e>
+                      <m:sSub>
+                        <m:e>
+                          <m:r>
+                            <m:rPr>
+                              <m:sty m:val="i"/>
+                            </m:rPr>
+                            <m:t xml:space="preserve">v</m:t>
+                          </m:r>
+                        </m:e>
+                        <m:sub>
+                          <m:r>
+                            <m:rPr>
+                              <m:sty m:val="p"/>
+                            </m:rPr>
+                            <m:t xml:space="preserve">0</m:t>
+                          </m:r>
+                        </m:sub>
+                      </m:sSub>
+                    </m:e>
+                    <m:sup>
+                      <m:r>
+                        <m:rPr>
+                          <m:sty m:val="p"/>
+                        </m:rPr>
+                        <m:t xml:space="preserve">2</m:t>
+                      </m:r>
+                    </m:sup>
+                  </m:sSup>
                   <m:r>
                     <m:rPr>
                       <m:sty m:val="p"/>
                     </m:rPr>
-                    <m:t xml:space="preserve">(−8.00)</m:t>
+                    <m:t xml:space="preserve"> + 2</m:t>
+                  </m:r>
+                  <m:r>
+                    <m:rPr>
+                      <m:sty m:val="i"/>
+                    </m:rPr>
+                    <m:t xml:space="preserve">a</m:t>
+                  </m:r>
+                  <m:r>
+                    <m:rPr>
+                      <m:sty m:val="p"/>
+                    </m:rPr>
+                    <m:t xml:space="preserve">(</m:t>
+                  </m:r>
+                  <m:r>
+                    <m:rPr>
+                      <m:sty m:val="i"/>
+                    </m:rPr>
+                    <m:t xml:space="preserve">y</m:t>
+                  </m:r>
+                  <m:r>
+                    <m:rPr>
+                      <m:sty m:val="p"/>
+                    </m:rPr>
+                    <m:t xml:space="preserve"> − </m:t>
+                  </m:r>
+                  <m:sSub>
+                    <m:e>
+                      <m:r>
+                        <m:rPr>
+                          <m:sty m:val="i"/>
+                        </m:rPr>
+                        <m:t xml:space="preserve">y</m:t>
+                      </m:r>
+                    </m:e>
+                    <m:sub>
+                      <m:r>
+                        <m:rPr>
+                          <m:sty m:val="p"/>
+                        </m:rPr>
+                        <m:t xml:space="preserve">0</m:t>
+                      </m:r>
+                    </m:sub>
+                  </m:sSub>
+                  <m:r>
+                    <m:rPr>
+                      <m:sty m:val="p"/>
+                    </m:rPr>
+                    <m:t xml:space="preserve">)</m:t>
                   </m:r>
                 </m:e>
-                <m:sup>
-                  <m:r>
-                    <m:rPr>
-                      <m:sty m:val="p"/>
-                    </m:rPr>
-                    <m:t xml:space="preserve">2</m:t>
-                  </m:r>
-                </m:sup>
-              </m:sSup>
-              <m:r>
-                <m:rPr>
-                  <m:sty m:val="p"/>
-                </m:rPr>
-                <m:t xml:space="preserve"> + 2(−9.81)(−8.00 − 0)</m:t>
-              </m:r>
+              </m:rad>
             </m:oMath>
           </w:p>
         </w:tc>
@@ -3903,6 +3815,14 @@
               <w:spacing w:before="30" w:after="30"/>
               <w:jc w:val="right"/>
             </w:pPr>
+            <m:oMath>
+              <m:r>
+                <m:rPr>
+                  <m:sty m:val="i"/>
+                </m:rPr>
+                <m:t xml:space="preserve">v</m:t>
+              </m:r>
+            </m:oMath>
           </w:p>
         </w:tc>
         <w:tc>
@@ -3920,90 +3840,40 @@
                 <m:rPr>
                   <m:sty m:val="p"/>
                 </m:rPr>
-                <m:t xml:space="preserve">= 64.0 + 156.96</m:t>
-              </m:r>
-            </m:oMath>
-          </w:p>
-        </w:tc>
-      </w:tr>
-      <w:tr>
-        <w:tc>
-          <w:tcPr>
-            <w:tcW w:w="0" w:type="auto"/>
-            <w:vAlign w:val="center"/>
-          </w:tcPr>
-          <w:p>
-            <w:pPr>
-              <w:spacing w:before="30" w:after="30"/>
-              <w:jc w:val="right"/>
-            </w:pPr>
-          </w:p>
-        </w:tc>
-        <w:tc>
-          <w:tcPr>
-            <w:tcW w:w="0" w:type="auto"/>
-            <w:vAlign w:val="center"/>
-          </w:tcPr>
-          <w:p>
-            <w:pPr>
-              <w:spacing w:before="30" w:after="30"/>
-              <w:jc w:val="left"/>
-            </w:pPr>
-            <m:oMath>
-              <m:r>
-                <m:rPr>
-                  <m:sty m:val="p"/>
-                </m:rPr>
-                <m:t xml:space="preserve">= 220.96</m:t>
-              </m:r>
-            </m:oMath>
-          </w:p>
-        </w:tc>
-      </w:tr>
-      <w:tr>
-        <w:tc>
-          <w:tcPr>
-            <w:tcW w:w="0" w:type="auto"/>
-            <w:vAlign w:val="center"/>
-          </w:tcPr>
-          <w:p>
-            <w:pPr>
-              <w:spacing w:before="30" w:after="30"/>
-              <w:jc w:val="right"/>
-            </w:pPr>
-            <m:oMath>
-              <m:r>
-                <m:rPr>
-                  <m:sty m:val="i"/>
-                </m:rPr>
-                <m:t xml:space="preserve">v</m:t>
-              </m:r>
-            </m:oMath>
-          </w:p>
-        </w:tc>
-        <w:tc>
-          <w:tcPr>
-            <w:tcW w:w="0" w:type="auto"/>
-            <w:vAlign w:val="center"/>
-          </w:tcPr>
-          <w:p>
-            <w:pPr>
-              <w:spacing w:before="30" w:after="30"/>
-              <w:jc w:val="left"/>
-            </w:pPr>
-            <m:oMath>
-              <m:r>
-                <m:rPr>
-                  <m:sty m:val="p"/>
-                </m:rPr>
-                <m:t xml:space="preserve">= ±14.9 </m:t>
-              </m:r>
-              <m:r>
-                <m:rPr>
-                  <m:sty m:val="p"/>
-                </m:rPr>
-                <m:t xml:space="preserve">m/s</m:t>
-              </m:r>
+                <m:t xml:space="preserve">= ±</m:t>
+              </m:r>
+              <m:rad>
+                <m:radPr>
+                  <m:degHide m:val="1"/>
+                </m:radPr>
+                <m:deg/>
+                <m:e>
+                  <m:sSup>
+                    <m:e>
+                      <m:r>
+                        <m:rPr>
+                          <m:sty m:val="p"/>
+                        </m:rPr>
+                        <m:t xml:space="preserve">(−8.00)</m:t>
+                      </m:r>
+                    </m:e>
+                    <m:sup>
+                      <m:r>
+                        <m:rPr>
+                          <m:sty m:val="p"/>
+                        </m:rPr>
+                        <m:t xml:space="preserve">2</m:t>
+                      </m:r>
+                    </m:sup>
+                  </m:sSup>
+                  <m:r>
+                    <m:rPr>
+                      <m:sty m:val="p"/>
+                    </m:rPr>
+                    <m:t xml:space="preserve"> + 2(−9.81)(−8.00 − 0)</m:t>
+                  </m:r>
+                </m:e>
+              </m:rad>
             </m:oMath>
           </w:p>
         </w:tc>
@@ -4995,7 +4865,22 @@
           <w:color w:val="222222"/>
           <w:sz w:val="22"/>
         </w:rPr>
-        <w:t xml:space="preserve">Substitute </w:t>
+        <w:t xml:space="preserve">Solve for </w:t>
+      </w:r>
+      <m:oMath>
+        <m:r>
+          <m:rPr>
+            <m:sty m:val="i"/>
+          </m:rPr>
+          <m:t xml:space="preserve">v</m:t>
+        </m:r>
+      </m:oMath>
+      <w:r>
+        <w:rPr>
+          <w:color w:val="222222"/>
+          <w:sz w:val="22"/>
+        </w:rPr>
+        <w:t xml:space="preserve"> (take the square root), then substitute </w:t>
       </w:r>
       <m:oMath>
         <m:sSub>
@@ -5082,7 +4967,7 @@
       </w:tblPr>
       <w:tblGrid>
         <w:gridCol w:w="500"/>
-        <w:gridCol w:w="3640"/>
+        <w:gridCol w:w="4290"/>
       </w:tblGrid>
       <w:tr>
         <w:tc>
@@ -5096,24 +4981,12 @@
               <w:jc w:val="right"/>
             </w:pPr>
             <m:oMath>
-              <m:sSup>
-                <m:e>
-                  <m:r>
-                    <m:rPr>
-                      <m:sty m:val="i"/>
-                    </m:rPr>
-                    <m:t xml:space="preserve">v</m:t>
-                  </m:r>
-                </m:e>
-                <m:sup>
-                  <m:r>
-                    <m:rPr>
-                      <m:sty m:val="p"/>
-                    </m:rPr>
-                    <m:t xml:space="preserve">2</m:t>
-                  </m:r>
-                </m:sup>
-              </m:sSup>
+              <m:r>
+                <m:rPr>
+                  <m:sty m:val="i"/>
+                </m:rPr>
+                <m:t xml:space="preserve">v</m:t>
+              </m:r>
             </m:oMath>
           </w:p>
         </w:tc>
@@ -5132,32 +5005,100 @@
                 <m:rPr>
                   <m:sty m:val="p"/>
                 </m:rPr>
-                <m:t xml:space="preserve">= </m:t>
-              </m:r>
-              <m:sSup>
+                <m:t xml:space="preserve">= ±</m:t>
+              </m:r>
+              <m:rad>
+                <m:radPr>
+                  <m:degHide m:val="1"/>
+                </m:radPr>
+                <m:deg/>
                 <m:e>
+                  <m:sSup>
+                    <m:e>
+                      <m:sSub>
+                        <m:e>
+                          <m:r>
+                            <m:rPr>
+                              <m:sty m:val="i"/>
+                            </m:rPr>
+                            <m:t xml:space="preserve">v</m:t>
+                          </m:r>
+                        </m:e>
+                        <m:sub>
+                          <m:r>
+                            <m:rPr>
+                              <m:sty m:val="p"/>
+                            </m:rPr>
+                            <m:t xml:space="preserve">0</m:t>
+                          </m:r>
+                        </m:sub>
+                      </m:sSub>
+                    </m:e>
+                    <m:sup>
+                      <m:r>
+                        <m:rPr>
+                          <m:sty m:val="p"/>
+                        </m:rPr>
+                        <m:t xml:space="preserve">2</m:t>
+                      </m:r>
+                    </m:sup>
+                  </m:sSup>
                   <m:r>
                     <m:rPr>
                       <m:sty m:val="p"/>
                     </m:rPr>
-                    <m:t xml:space="preserve">(9.50)</m:t>
+                    <m:t xml:space="preserve"> + 2</m:t>
+                  </m:r>
+                  <m:r>
+                    <m:rPr>
+                      <m:sty m:val="i"/>
+                    </m:rPr>
+                    <m:t xml:space="preserve">a</m:t>
+                  </m:r>
+                  <m:r>
+                    <m:rPr>
+                      <m:sty m:val="p"/>
+                    </m:rPr>
+                    <m:t xml:space="preserve">(</m:t>
+                  </m:r>
+                  <m:r>
+                    <m:rPr>
+                      <m:sty m:val="i"/>
+                    </m:rPr>
+                    <m:t xml:space="preserve">y</m:t>
+                  </m:r>
+                  <m:r>
+                    <m:rPr>
+                      <m:sty m:val="p"/>
+                    </m:rPr>
+                    <m:t xml:space="preserve"> − </m:t>
+                  </m:r>
+                  <m:sSub>
+                    <m:e>
+                      <m:r>
+                        <m:rPr>
+                          <m:sty m:val="i"/>
+                        </m:rPr>
+                        <m:t xml:space="preserve">y</m:t>
+                      </m:r>
+                    </m:e>
+                    <m:sub>
+                      <m:r>
+                        <m:rPr>
+                          <m:sty m:val="p"/>
+                        </m:rPr>
+                        <m:t xml:space="preserve">0</m:t>
+                      </m:r>
+                    </m:sub>
+                  </m:sSub>
+                  <m:r>
+                    <m:rPr>
+                      <m:sty m:val="p"/>
+                    </m:rPr>
+                    <m:t xml:space="preserve">)</m:t>
                   </m:r>
                 </m:e>
-                <m:sup>
-                  <m:r>
-                    <m:rPr>
-                      <m:sty m:val="p"/>
-                    </m:rPr>
-                    <m:t xml:space="preserve">2</m:t>
-                  </m:r>
-                </m:sup>
-              </m:sSup>
-              <m:r>
-                <m:rPr>
-                  <m:sty m:val="p"/>
-                </m:rPr>
-                <m:t xml:space="preserve"> + 2(−9.81)(3.60)</m:t>
-              </m:r>
+              </m:rad>
             </m:oMath>
           </w:p>
         </w:tc>
@@ -5173,6 +5114,14 @@
               <w:spacing w:before="30" w:after="30"/>
               <w:jc w:val="right"/>
             </w:pPr>
+            <m:oMath>
+              <m:r>
+                <m:rPr>
+                  <m:sty m:val="i"/>
+                </m:rPr>
+                <m:t xml:space="preserve">v</m:t>
+              </m:r>
+            </m:oMath>
           </w:p>
         </w:tc>
         <w:tc>
@@ -5190,90 +5139,40 @@
                 <m:rPr>
                   <m:sty m:val="p"/>
                 </m:rPr>
-                <m:t xml:space="preserve">= 90.25 − 70.632</m:t>
-              </m:r>
-            </m:oMath>
-          </w:p>
-        </w:tc>
-      </w:tr>
-      <w:tr>
-        <w:tc>
-          <w:tcPr>
-            <w:tcW w:w="0" w:type="auto"/>
-            <w:vAlign w:val="center"/>
-          </w:tcPr>
-          <w:p>
-            <w:pPr>
-              <w:spacing w:before="30" w:after="30"/>
-              <w:jc w:val="right"/>
-            </w:pPr>
-          </w:p>
-        </w:tc>
-        <w:tc>
-          <w:tcPr>
-            <w:tcW w:w="0" w:type="auto"/>
-            <w:vAlign w:val="center"/>
-          </w:tcPr>
-          <w:p>
-            <w:pPr>
-              <w:spacing w:before="30" w:after="30"/>
-              <w:jc w:val="left"/>
-            </w:pPr>
-            <m:oMath>
-              <m:r>
-                <m:rPr>
-                  <m:sty m:val="p"/>
-                </m:rPr>
-                <m:t xml:space="preserve">= 19.62</m:t>
-              </m:r>
-            </m:oMath>
-          </w:p>
-        </w:tc>
-      </w:tr>
-      <w:tr>
-        <w:tc>
-          <w:tcPr>
-            <w:tcW w:w="0" w:type="auto"/>
-            <w:vAlign w:val="center"/>
-          </w:tcPr>
-          <w:p>
-            <w:pPr>
-              <w:spacing w:before="30" w:after="30"/>
-              <w:jc w:val="right"/>
-            </w:pPr>
-            <m:oMath>
-              <m:r>
-                <m:rPr>
-                  <m:sty m:val="i"/>
-                </m:rPr>
-                <m:t xml:space="preserve">v</m:t>
-              </m:r>
-            </m:oMath>
-          </w:p>
-        </w:tc>
-        <w:tc>
-          <w:tcPr>
-            <w:tcW w:w="0" w:type="auto"/>
-            <w:vAlign w:val="center"/>
-          </w:tcPr>
-          <w:p>
-            <w:pPr>
-              <w:spacing w:before="30" w:after="30"/>
-              <w:jc w:val="left"/>
-            </w:pPr>
-            <m:oMath>
-              <m:r>
-                <m:rPr>
-                  <m:sty m:val="p"/>
-                </m:rPr>
-                <m:t xml:space="preserve">= ±4.43 </m:t>
-              </m:r>
-              <m:r>
-                <m:rPr>
-                  <m:sty m:val="p"/>
-                </m:rPr>
-                <m:t xml:space="preserve">m/s</m:t>
-              </m:r>
+                <m:t xml:space="preserve">= ±</m:t>
+              </m:r>
+              <m:rad>
+                <m:radPr>
+                  <m:degHide m:val="1"/>
+                </m:radPr>
+                <m:deg/>
+                <m:e>
+                  <m:sSup>
+                    <m:e>
+                      <m:r>
+                        <m:rPr>
+                          <m:sty m:val="p"/>
+                        </m:rPr>
+                        <m:t xml:space="preserve">(9.50)</m:t>
+                      </m:r>
+                    </m:e>
+                    <m:sup>
+                      <m:r>
+                        <m:rPr>
+                          <m:sty m:val="p"/>
+                        </m:rPr>
+                        <m:t xml:space="preserve">2</m:t>
+                      </m:r>
+                    </m:sup>
+                  </m:sSup>
+                  <m:r>
+                    <m:rPr>
+                      <m:sty m:val="p"/>
+                    </m:rPr>
+                    <m:t xml:space="preserve"> + 2(−9.81)(3.60)</m:t>
+                  </m:r>
+                </m:e>
+              </m:rad>
             </m:oMath>
           </w:p>
         </w:tc>
@@ -5613,7 +5512,7 @@
           <w:color w:val="222222"/>
           <w:sz w:val="22"/>
         </w:rPr>
-        <w:t xml:space="preserve"> and solve the quadratic for </w:t>
+        <w:t xml:space="preserve">. Because </w:t>
       </w:r>
       <m:oMath>
         <m:r>
@@ -5628,7 +5527,22 @@
           <w:color w:val="222222"/>
           <w:sz w:val="22"/>
         </w:rPr>
-        <w:t xml:space="preserve">.</w:t>
+        <w:t xml:space="preserve"> is squared, this is a quadratic — rearrange to standard form and isolate </w:t>
+      </w:r>
+      <m:oMath>
+        <m:r>
+          <m:rPr>
+            <m:sty m:val="i"/>
+          </m:rPr>
+          <m:t xml:space="preserve">t</m:t>
+        </m:r>
+      </m:oMath>
+      <w:r>
+        <w:rPr>
+          <w:color w:val="222222"/>
+          <w:sz w:val="22"/>
+        </w:rPr>
+        <w:t xml:space="preserve"> first.</w:t>
       </w:r>
     </w:p>
     <w:p>
@@ -5792,24 +5706,60 @@
           <w:color w:val="222222"/>
           <w:sz w:val="22"/>
         </w:rPr>
-        <w:t xml:space="preserve">Substitute </w:t>
+        <w:t xml:space="preserve">Write it as </w:t>
       </w:r>
       <m:oMath>
+        <m:f>
+          <m:fPr>
+            <m:type m:val="bar"/>
+          </m:fPr>
+          <m:num>
+            <m:r>
+              <m:rPr>
+                <m:sty m:val="p"/>
+              </m:rPr>
+              <m:t xml:space="preserve">1</m:t>
+            </m:r>
+          </m:num>
+          <m:den>
+            <m:r>
+              <m:rPr>
+                <m:sty m:val="p"/>
+              </m:rPr>
+              <m:t xml:space="preserve">2</m:t>
+            </m:r>
+          </m:den>
+        </m:f>
         <m:r>
           <m:rPr>
             <m:sty m:val="i"/>
           </m:rPr>
-          <m:t xml:space="preserve">y</m:t>
+          <m:t xml:space="preserve">a</m:t>
         </m:r>
-      </m:oMath>
-      <w:r>
-        <w:rPr>
-          <w:color w:val="222222"/>
-          <w:sz w:val="22"/>
-        </w:rPr>
-        <w:t xml:space="preserve"> = 3.60 m, </w:t>
-      </w:r>
-      <m:oMath>
+        <m:sSup>
+          <m:e>
+            <m:r>
+              <m:rPr>
+                <m:sty m:val="i"/>
+              </m:rPr>
+              <m:t xml:space="preserve">t</m:t>
+            </m:r>
+          </m:e>
+          <m:sup>
+            <m:r>
+              <m:rPr>
+                <m:sty m:val="p"/>
+              </m:rPr>
+              <m:t xml:space="preserve">2</m:t>
+            </m:r>
+          </m:sup>
+        </m:sSup>
+        <m:r>
+          <m:rPr>
+            <m:sty m:val="p"/>
+          </m:rPr>
+          <m:t xml:space="preserve"> + </m:t>
+        </m:r>
         <m:sSub>
           <m:e>
             <m:r>
@@ -5828,20 +5778,44 @@
             </m:r>
           </m:sub>
         </m:sSub>
+        <m:r>
+          <m:rPr>
+            <m:sty m:val="i"/>
+          </m:rPr>
+          <m:t xml:space="preserve">t</m:t>
+        </m:r>
+        <m:r>
+          <m:rPr>
+            <m:sty m:val="p"/>
+          </m:rPr>
+          <m:t xml:space="preserve"> − </m:t>
+        </m:r>
+        <m:r>
+          <m:rPr>
+            <m:sty m:val="i"/>
+          </m:rPr>
+          <m:t xml:space="preserve">y</m:t>
+        </m:r>
+        <m:r>
+          <m:rPr>
+            <m:sty m:val="p"/>
+          </m:rPr>
+          <m:t xml:space="preserve"> = 0</m:t>
+        </m:r>
       </m:oMath>
       <w:r>
         <w:rPr>
           <w:color w:val="222222"/>
           <w:sz w:val="22"/>
         </w:rPr>
-        <w:t xml:space="preserve"> = 9.50 m/s, </w:t>
+        <w:t xml:space="preserve"> and solve for </w:t>
       </w:r>
       <m:oMath>
         <m:r>
           <m:rPr>
             <m:sty m:val="i"/>
           </m:rPr>
-          <m:t xml:space="preserve">a</m:t>
+          <m:t xml:space="preserve">t</m:t>
         </m:r>
       </m:oMath>
       <w:r>
@@ -5849,7 +5823,7 @@
           <w:color w:val="222222"/>
           <w:sz w:val="22"/>
         </w:rPr>
-        <w:t xml:space="preserve"> = −9.81 m/s², and rearrange into standard quadratic form:</w:t>
+        <w:t xml:space="preserve"> with the quadratic formula:</w:t>
       </w:r>
     </w:p>
     <w:p>
@@ -5878,8 +5852,8 @@
         </w:tblCellMar>
       </w:tblPr>
       <w:tblGrid>
-        <w:gridCol w:w="3060"/>
-        <w:gridCol w:w="900"/>
+        <w:gridCol w:w="2020"/>
+        <w:gridCol w:w="3770"/>
       </w:tblGrid>
       <w:tr>
         <w:tc>
@@ -5893,11 +5867,32 @@
               <w:jc w:val="right"/>
             </w:pPr>
             <m:oMath>
-              <m:r>
-                <m:rPr>
-                  <m:sty m:val="p"/>
-                </m:rPr>
-                <m:t xml:space="preserve">4.905</m:t>
+              <m:f>
+                <m:fPr>
+                  <m:type m:val="bar"/>
+                </m:fPr>
+                <m:num>
+                  <m:r>
+                    <m:rPr>
+                      <m:sty m:val="p"/>
+                    </m:rPr>
+                    <m:t xml:space="preserve">1</m:t>
+                  </m:r>
+                </m:num>
+                <m:den>
+                  <m:r>
+                    <m:rPr>
+                      <m:sty m:val="p"/>
+                    </m:rPr>
+                    <m:t xml:space="preserve">2</m:t>
+                  </m:r>
+                </m:den>
+              </m:f>
+              <m:r>
+                <m:rPr>
+                  <m:sty m:val="i"/>
+                </m:rPr>
+                <m:t xml:space="preserve">a</m:t>
               </m:r>
               <m:sSup>
                 <m:e>
@@ -5921,8 +5916,26 @@
                 <m:rPr>
                   <m:sty m:val="p"/>
                 </m:rPr>
-                <m:t xml:space="preserve"> − 9.50</m:t>
-              </m:r>
+                <m:t xml:space="preserve"> + </m:t>
+              </m:r>
+              <m:sSub>
+                <m:e>
+                  <m:r>
+                    <m:rPr>
+                      <m:sty m:val="i"/>
+                    </m:rPr>
+                    <m:t xml:space="preserve">v</m:t>
+                  </m:r>
+                </m:e>
+                <m:sub>
+                  <m:r>
+                    <m:rPr>
+                      <m:sty m:val="p"/>
+                    </m:rPr>
+                    <m:t xml:space="preserve">0</m:t>
+                  </m:r>
+                </m:sub>
+              </m:sSub>
               <m:r>
                 <m:rPr>
                   <m:sty m:val="i"/>
@@ -5933,7 +5946,13 @@
                 <m:rPr>
                   <m:sty m:val="p"/>
                 </m:rPr>
-                <m:t xml:space="preserve"> + 3.60</m:t>
+                <m:t xml:space="preserve"> − </m:t>
+              </m:r>
+              <m:r>
+                <m:rPr>
+                  <m:sty m:val="i"/>
+                </m:rPr>
+                <m:t xml:space="preserve">y</m:t>
               </m:r>
             </m:oMath>
           </w:p>
@@ -5959,6 +5978,143 @@
           </w:p>
         </w:tc>
       </w:tr>
+      <w:tr>
+        <w:tc>
+          <w:tcPr>
+            <w:tcW w:w="0" w:type="auto"/>
+            <w:vAlign w:val="center"/>
+          </w:tcPr>
+          <w:p>
+            <w:pPr>
+              <w:spacing w:before="30" w:after="30"/>
+              <w:jc w:val="right"/>
+            </w:pPr>
+            <m:oMath>
+              <m:r>
+                <m:rPr>
+                  <m:sty m:val="i"/>
+                </m:rPr>
+                <m:t xml:space="preserve">t</m:t>
+              </m:r>
+            </m:oMath>
+          </w:p>
+        </w:tc>
+        <w:tc>
+          <w:tcPr>
+            <w:tcW w:w="0" w:type="auto"/>
+            <w:vAlign w:val="center"/>
+          </w:tcPr>
+          <w:p>
+            <w:pPr>
+              <w:spacing w:before="30" w:after="30"/>
+              <w:jc w:val="left"/>
+            </w:pPr>
+            <m:oMath>
+              <m:r>
+                <m:rPr>
+                  <m:sty m:val="p"/>
+                </m:rPr>
+                <m:t xml:space="preserve">= </m:t>
+              </m:r>
+              <m:f>
+                <m:fPr>
+                  <m:type m:val="bar"/>
+                </m:fPr>
+                <m:num>
+                  <m:r>
+                    <m:rPr>
+                      <m:sty m:val="p"/>
+                    </m:rPr>
+                    <m:t xml:space="preserve">−</m:t>
+                  </m:r>
+                  <m:sSub>
+                    <m:e>
+                      <m:r>
+                        <m:rPr>
+                          <m:sty m:val="i"/>
+                        </m:rPr>
+                        <m:t xml:space="preserve">v</m:t>
+                      </m:r>
+                    </m:e>
+                    <m:sub>
+                      <m:r>
+                        <m:rPr>
+                          <m:sty m:val="p"/>
+                        </m:rPr>
+                        <m:t xml:space="preserve">0</m:t>
+                      </m:r>
+                    </m:sub>
+                  </m:sSub>
+                  <m:r>
+                    <m:rPr>
+                      <m:sty m:val="p"/>
+                    </m:rPr>
+                    <m:t xml:space="preserve"> ± </m:t>
+                  </m:r>
+                  <m:rad>
+                    <m:radPr>
+                      <m:degHide m:val="1"/>
+                    </m:radPr>
+                    <m:deg/>
+                    <m:e>
+                      <m:sSup>
+                        <m:e>
+                          <m:sSub>
+                            <m:e>
+                              <m:r>
+                                <m:rPr>
+                                  <m:sty m:val="i"/>
+                                </m:rPr>
+                                <m:t xml:space="preserve">v</m:t>
+                              </m:r>
+                            </m:e>
+                            <m:sub>
+                              <m:r>
+                                <m:rPr>
+                                  <m:sty m:val="p"/>
+                                </m:rPr>
+                                <m:t xml:space="preserve">0</m:t>
+                              </m:r>
+                            </m:sub>
+                          </m:sSub>
+                        </m:e>
+                        <m:sup>
+                          <m:r>
+                            <m:rPr>
+                              <m:sty m:val="p"/>
+                            </m:rPr>
+                            <m:t xml:space="preserve">2</m:t>
+                          </m:r>
+                        </m:sup>
+                      </m:sSup>
+                      <m:r>
+                        <m:rPr>
+                          <m:sty m:val="p"/>
+                        </m:rPr>
+                        <m:t xml:space="preserve"> + 2</m:t>
+                      </m:r>
+                      <m:r>
+                        <m:rPr>
+                          <m:sty m:val="i"/>
+                        </m:rPr>
+                        <m:t xml:space="preserve">ay</m:t>
+                      </m:r>
+                    </m:e>
+                  </m:rad>
+                </m:num>
+                <m:den>
+                  <m:r>
+                    <m:rPr>
+                      <m:sty m:val="i"/>
+                    </m:rPr>
+                    <m:t xml:space="preserve">a</m:t>
+                  </m:r>
+                </m:den>
+              </m:f>
+            </m:oMath>
+          </w:p>
+        </w:tc>
+      </w:tr>
     </w:tbl>
     <w:p>
       <w:pPr>
@@ -5974,7 +6130,64 @@
           <w:color w:val="222222"/>
           <w:sz w:val="22"/>
         </w:rPr>
-        <w:t xml:space="preserve">Solve with the quadratic formula:</w:t>
+        <w:t xml:space="preserve">Substitute </w:t>
+      </w:r>
+      <m:oMath>
+        <m:sSub>
+          <m:e>
+            <m:r>
+              <m:rPr>
+                <m:sty m:val="i"/>
+              </m:rPr>
+              <m:t xml:space="preserve">v</m:t>
+            </m:r>
+          </m:e>
+          <m:sub>
+            <m:r>
+              <m:rPr>
+                <m:sty m:val="p"/>
+              </m:rPr>
+              <m:t xml:space="preserve">0</m:t>
+            </m:r>
+          </m:sub>
+        </m:sSub>
+      </m:oMath>
+      <w:r>
+        <w:rPr>
+          <w:color w:val="222222"/>
+          <w:sz w:val="22"/>
+        </w:rPr>
+        <w:t xml:space="preserve"> = 9.50 m/s, </w:t>
+      </w:r>
+      <m:oMath>
+        <m:r>
+          <m:rPr>
+            <m:sty m:val="i"/>
+          </m:rPr>
+          <m:t xml:space="preserve">a</m:t>
+        </m:r>
+      </m:oMath>
+      <w:r>
+        <w:rPr>
+          <w:color w:val="222222"/>
+          <w:sz w:val="22"/>
+        </w:rPr>
+        <w:t xml:space="preserve"> = −9.81 m/s², </w:t>
+      </w:r>
+      <m:oMath>
+        <m:r>
+          <m:rPr>
+            <m:sty m:val="i"/>
+          </m:rPr>
+          <m:t xml:space="preserve">y</m:t>
+        </m:r>
+      </m:oMath>
+      <w:r>
+        <w:rPr>
+          <w:color w:val="222222"/>
+          <w:sz w:val="22"/>
+        </w:rPr>
+        <w:t xml:space="preserve"> = 3.60 m:</w:t>
       </w:r>
     </w:p>
     <w:p>
@@ -6004,7 +6217,7 @@
       </w:tblPr>
       <w:tblGrid>
         <w:gridCol w:w="500"/>
-        <w:gridCol w:w="6600"/>
+        <w:gridCol w:w="6500"/>
       </w:tblGrid>
       <w:tr>
         <w:tc>
@@ -6053,7 +6266,7 @@
                     <m:rPr>
                       <m:sty m:val="p"/>
                     </m:rPr>
-                    <m:t xml:space="preserve">9.50 ± </m:t>
+                    <m:t xml:space="preserve">−9.50 ± </m:t>
                   </m:r>
                   <m:rad>
                     <m:radPr>
@@ -6067,7 +6280,7 @@
                             <m:rPr>
                               <m:sty m:val="p"/>
                             </m:rPr>
-                            <m:t xml:space="preserve">9.50</m:t>
+                            <m:t xml:space="preserve">(9.50)</m:t>
                           </m:r>
                         </m:e>
                         <m:sup>
@@ -6083,7 +6296,7 @@
                         <m:rPr>
                           <m:sty m:val="p"/>
                         </m:rPr>
-                        <m:t xml:space="preserve"> − 4(4.905)(3.60)</m:t>
+                        <m:t xml:space="preserve"> + 2(−9.81)(3.60)</m:t>
                       </m:r>
                     </m:e>
                   </m:rad>
@@ -6093,34 +6306,7 @@
                     <m:rPr>
                       <m:sty m:val="p"/>
                     </m:rPr>
-                    <m:t xml:space="preserve">2 × 4.905</m:t>
-                  </m:r>
-                </m:den>
-              </m:f>
-              <m:r>
-                <m:rPr>
-                  <m:sty m:val="p"/>
-                </m:rPr>
-                <m:t xml:space="preserve"> = </m:t>
-              </m:r>
-              <m:f>
-                <m:fPr>
-                  <m:type m:val="bar"/>
-                </m:fPr>
-                <m:num>
-                  <m:r>
-                    <m:rPr>
-                      <m:sty m:val="p"/>
-                    </m:rPr>
-                    <m:t xml:space="preserve">9.50 ± 4.43</m:t>
-                  </m:r>
-                </m:num>
-                <m:den>
-                  <m:r>
-                    <m:rPr>
-                      <m:sty m:val="p"/>
-                    </m:rPr>
-                    <m:t xml:space="preserve">9.81</m:t>
+                    <m:t xml:space="preserve">−9.81</m:t>
                   </m:r>
                 </m:den>
               </m:f>
@@ -6977,7 +7163,34 @@
           <w:color w:val="222222"/>
           <w:sz w:val="22"/>
         </w:rPr>
-        <w:t xml:space="preserve">Use symmetry to find the time to reach maximum height.</w:t>
+        <w:t xml:space="preserve">Use symmetry to find the time to reach maximum height — isolate </w:t>
+      </w:r>
+      <m:oMath>
+        <m:sSub>
+          <m:e>
+            <m:r>
+              <m:rPr>
+                <m:sty m:val="i"/>
+              </m:rPr>
+              <m:t xml:space="preserve">t</m:t>
+            </m:r>
+          </m:e>
+          <m:sub>
+            <m:r>
+              <m:rPr>
+                <m:sty m:val="i"/>
+              </m:rPr>
+              <m:t xml:space="preserve">up</m:t>
+            </m:r>
+          </m:sub>
+        </m:sSub>
+      </m:oMath>
+      <w:r>
+        <w:rPr>
+          <w:color w:val="222222"/>
+          <w:sz w:val="22"/>
+        </w:rPr>
+        <w:t xml:space="preserve"> as half the total flight time.</w:t>
       </w:r>
     </w:p>
     <w:p>
@@ -7007,7 +7220,7 @@
       </w:tblPr>
       <w:tblGrid>
         <w:gridCol w:w="590"/>
-        <w:gridCol w:w="4940"/>
+        <w:gridCol w:w="2860"/>
       </w:tblGrid>
       <w:tr>
         <w:tc>
@@ -7080,23 +7293,77 @@
                   </m:r>
                 </m:den>
               </m:f>
+              <m:sSub>
+                <m:e>
+                  <m:r>
+                    <m:rPr>
+                      <m:sty m:val="i"/>
+                    </m:rPr>
+                    <m:t xml:space="preserve">t</m:t>
+                  </m:r>
+                </m:e>
+                <m:sub>
+                  <m:r>
+                    <m:rPr>
+                      <m:sty m:val="i"/>
+                    </m:rPr>
+                    <m:t xml:space="preserve">total</m:t>
+                  </m:r>
+                </m:sub>
+              </m:sSub>
+            </m:oMath>
+          </w:p>
+        </w:tc>
+      </w:tr>
+      <w:tr>
+        <w:tc>
+          <w:tcPr>
+            <w:tcW w:w="0" w:type="auto"/>
+            <w:vAlign w:val="center"/>
+          </w:tcPr>
+          <w:p>
+            <w:pPr>
+              <w:spacing w:before="30" w:after="30"/>
+              <w:jc w:val="right"/>
+            </w:pPr>
+            <m:oMath>
+              <m:sSub>
+                <m:e>
+                  <m:r>
+                    <m:rPr>
+                      <m:sty m:val="i"/>
+                    </m:rPr>
+                    <m:t xml:space="preserve">t</m:t>
+                  </m:r>
+                </m:e>
+                <m:sub>
+                  <m:r>
+                    <m:rPr>
+                      <m:sty m:val="i"/>
+                    </m:rPr>
+                    <m:t xml:space="preserve">up</m:t>
+                  </m:r>
+                </m:sub>
+              </m:sSub>
+            </m:oMath>
+          </w:p>
+        </w:tc>
+        <w:tc>
+          <w:tcPr>
+            <w:tcW w:w="0" w:type="auto"/>
+            <w:vAlign w:val="center"/>
+          </w:tcPr>
+          <w:p>
+            <w:pPr>
+              <w:spacing w:before="30" w:after="30"/>
+              <w:jc w:val="left"/>
+            </w:pPr>
+            <m:oMath>
               <m:r>
                 <m:rPr>
                   <m:sty m:val="p"/>
                 </m:rPr>
-                <m:t xml:space="preserve">(</m:t>
-              </m:r>
-              <m:r>
-                <m:rPr>
-                  <m:sty m:val="p"/>
-                </m:rPr>
-                <m:t xml:space="preserve">total time</m:t>
-              </m:r>
-              <m:r>
-                <m:rPr>
-                  <m:sty m:val="p"/>
-                </m:rPr>
-                <m:t xml:space="preserve">) = </m:t>
+                <m:t xml:space="preserve">= </m:t>
               </m:r>
               <m:f>
                 <m:fPr>
@@ -7237,7 +7504,7 @@
           <w:color w:val="222222"/>
           <w:sz w:val="22"/>
         </w:rPr>
-        <w:t xml:space="preserve"> to back out </w:t>
+        <w:t xml:space="preserve"> and solve for </w:t>
       </w:r>
       <m:oMath>
         <m:sSub>
@@ -7294,7 +7561,7 @@
       </w:tblPr>
       <w:tblGrid>
         <w:gridCol w:w="500"/>
-        <w:gridCol w:w="2860"/>
+        <w:gridCol w:w="3770"/>
       </w:tblGrid>
       <w:tr>
         <w:tc>
@@ -7310,9 +7577,9 @@
             <m:oMath>
               <m:r>
                 <m:rPr>
-                  <m:sty m:val="p"/>
-                </m:rPr>
-                <m:t xml:space="preserve">0</m:t>
+                  <m:sty m:val="i"/>
+                </m:rPr>
+                <m:t xml:space="preserve">v</m:t>
               </m:r>
             </m:oMath>
           </w:p>
@@ -7356,7 +7623,13 @@
                 <m:rPr>
                   <m:sty m:val="p"/>
                 </m:rPr>
-                <m:t xml:space="preserve"> + (−9.81)(1.80)</m:t>
+                <m:t xml:space="preserve"> + </m:t>
+              </m:r>
+              <m:r>
+                <m:rPr>
+                  <m:sty m:val="i"/>
+                </m:rPr>
+                <m:t xml:space="preserve">at</m:t>
               </m:r>
             </m:oMath>
           </w:p>
@@ -7410,7 +7683,109 @@
                 <m:rPr>
                   <m:sty m:val="p"/>
                 </m:rPr>
-                <m:t xml:space="preserve">= 17.7 </m:t>
+                <m:t xml:space="preserve">= </m:t>
+              </m:r>
+              <m:r>
+                <m:rPr>
+                  <m:sty m:val="i"/>
+                </m:rPr>
+                <m:t xml:space="preserve">v</m:t>
+              </m:r>
+              <m:r>
+                <m:rPr>
+                  <m:sty m:val="p"/>
+                </m:rPr>
+                <m:t xml:space="preserve"> − </m:t>
+              </m:r>
+              <m:r>
+                <m:rPr>
+                  <m:sty m:val="i"/>
+                </m:rPr>
+                <m:t xml:space="preserve">at</m:t>
+              </m:r>
+              <m:r>
+                <m:rPr>
+                  <m:sty m:val="p"/>
+                </m:rPr>
+                <m:t xml:space="preserve"> = −</m:t>
+              </m:r>
+              <m:r>
+                <m:rPr>
+                  <m:sty m:val="i"/>
+                </m:rPr>
+                <m:t xml:space="preserve">a</m:t>
+              </m:r>
+              <m:sSub>
+                <m:e>
+                  <m:r>
+                    <m:rPr>
+                      <m:sty m:val="i"/>
+                    </m:rPr>
+                    <m:t xml:space="preserve">t</m:t>
+                  </m:r>
+                </m:e>
+                <m:sub>
+                  <m:r>
+                    <m:rPr>
+                      <m:sty m:val="i"/>
+                    </m:rPr>
+                    <m:t xml:space="preserve">up</m:t>
+                  </m:r>
+                </m:sub>
+              </m:sSub>
+            </m:oMath>
+          </w:p>
+        </w:tc>
+      </w:tr>
+      <w:tr>
+        <w:tc>
+          <w:tcPr>
+            <w:tcW w:w="0" w:type="auto"/>
+            <w:vAlign w:val="center"/>
+          </w:tcPr>
+          <w:p>
+            <w:pPr>
+              <w:spacing w:before="30" w:after="30"/>
+              <w:jc w:val="right"/>
+            </w:pPr>
+            <m:oMath>
+              <m:sSub>
+                <m:e>
+                  <m:r>
+                    <m:rPr>
+                      <m:sty m:val="i"/>
+                    </m:rPr>
+                    <m:t xml:space="preserve">v</m:t>
+                  </m:r>
+                </m:e>
+                <m:sub>
+                  <m:r>
+                    <m:rPr>
+                      <m:sty m:val="p"/>
+                    </m:rPr>
+                    <m:t xml:space="preserve">0</m:t>
+                  </m:r>
+                </m:sub>
+              </m:sSub>
+            </m:oMath>
+          </w:p>
+        </w:tc>
+        <w:tc>
+          <w:tcPr>
+            <w:tcW w:w="0" w:type="auto"/>
+            <w:vAlign w:val="center"/>
+          </w:tcPr>
+          <w:p>
+            <w:pPr>
+              <w:spacing w:before="30" w:after="30"/>
+              <w:jc w:val="left"/>
+            </w:pPr>
+            <m:oMath>
+              <m:r>
+                <m:rPr>
+                  <m:sty m:val="p"/>
+                </m:rPr>
+                <m:t xml:space="preserve">= −(−9.81)(1.80) = 17.7 </m:t>
               </m:r>
               <m:r>
                 <m:rPr>
@@ -7641,7 +8016,7 @@
           <w:color w:val="222222"/>
           <w:sz w:val="22"/>
         </w:rPr>
-        <w:t xml:space="preserve">, again with </w:t>
+        <w:t xml:space="preserve">, using </w:t>
       </w:r>
       <m:oMath>
         <m:r>
@@ -7656,7 +8031,184 @@
           <w:color w:val="222222"/>
           <w:sz w:val="22"/>
         </w:rPr>
-        <w:t xml:space="preserve"> = 0 at the top.</w:t>
+        <w:t xml:space="preserve"> = 0 and </w:t>
+      </w:r>
+      <m:oMath>
+        <m:r>
+          <m:rPr>
+            <m:sty m:val="i"/>
+          </m:rPr>
+          <m:t xml:space="preserve">y</m:t>
+        </m:r>
+        <m:r>
+          <m:rPr>
+            <m:sty m:val="p"/>
+          </m:rPr>
+          <m:t xml:space="preserve"> − </m:t>
+        </m:r>
+        <m:sSub>
+          <m:e>
+            <m:r>
+              <m:rPr>
+                <m:sty m:val="i"/>
+              </m:rPr>
+              <m:t xml:space="preserve">y</m:t>
+            </m:r>
+          </m:e>
+          <m:sub>
+            <m:r>
+              <m:rPr>
+                <m:sty m:val="p"/>
+              </m:rPr>
+              <m:t xml:space="preserve">0</m:t>
+            </m:r>
+          </m:sub>
+        </m:sSub>
+      </m:oMath>
+      <w:r>
+        <w:rPr>
+          <w:color w:val="222222"/>
+          <w:sz w:val="22"/>
+        </w:rPr>
+        <w:t xml:space="preserve"> = </w:t>
+      </w:r>
+      <m:oMath>
+        <m:r>
+          <m:rPr>
+            <m:sty m:val="i"/>
+          </m:rPr>
+          <m:t xml:space="preserve">h</m:t>
+        </m:r>
+      </m:oMath>
+      <w:r>
+        <w:rPr>
+          <w:color w:val="222222"/>
+          <w:sz w:val="22"/>
+        </w:rPr>
+        <w:t xml:space="preserve">. Since </w:t>
+      </w:r>
+      <m:oMath>
+        <m:sSub>
+          <m:e>
+            <m:r>
+              <m:rPr>
+                <m:sty m:val="i"/>
+              </m:rPr>
+              <m:t xml:space="preserve">v</m:t>
+            </m:r>
+          </m:e>
+          <m:sub>
+            <m:r>
+              <m:rPr>
+                <m:sty m:val="p"/>
+              </m:rPr>
+              <m:t xml:space="preserve">0</m:t>
+            </m:r>
+          </m:sub>
+        </m:sSub>
+      </m:oMath>
+      <w:r>
+        <w:rPr>
+          <w:color w:val="222222"/>
+          <w:sz w:val="22"/>
+        </w:rPr>
+        <w:t xml:space="preserve"> = </w:t>
+      </w:r>
+      <m:oMath>
+        <m:r>
+          <m:rPr>
+            <m:sty m:val="p"/>
+          </m:rPr>
+          <m:t xml:space="preserve">−</m:t>
+        </m:r>
+        <m:r>
+          <m:rPr>
+            <m:sty m:val="i"/>
+          </m:rPr>
+          <m:t xml:space="preserve">a</m:t>
+        </m:r>
+        <m:sSub>
+          <m:e>
+            <m:r>
+              <m:rPr>
+                <m:sty m:val="i"/>
+              </m:rPr>
+              <m:t xml:space="preserve">t</m:t>
+            </m:r>
+          </m:e>
+          <m:sub>
+            <m:r>
+              <m:rPr>
+                <m:sty m:val="i"/>
+              </m:rPr>
+              <m:t xml:space="preserve">up</m:t>
+            </m:r>
+          </m:sub>
+        </m:sSub>
+      </m:oMath>
+      <w:r>
+        <w:rPr>
+          <w:color w:val="222222"/>
+          <w:sz w:val="22"/>
+        </w:rPr>
+        <w:t xml:space="preserve">, solving for </w:t>
+      </w:r>
+      <m:oMath>
+        <m:r>
+          <m:rPr>
+            <m:sty m:val="i"/>
+          </m:rPr>
+          <m:t xml:space="preserve">h</m:t>
+        </m:r>
+      </m:oMath>
+      <w:r>
+        <w:rPr>
+          <w:color w:val="222222"/>
+          <w:sz w:val="22"/>
+        </w:rPr>
+        <w:t xml:space="preserve"> gives a form in </w:t>
+      </w:r>
+      <m:oMath>
+        <m:r>
+          <m:rPr>
+            <m:sty m:val="i"/>
+          </m:rPr>
+          <m:t xml:space="preserve">a</m:t>
+        </m:r>
+      </m:oMath>
+      <w:r>
+        <w:rPr>
+          <w:color w:val="222222"/>
+          <w:sz w:val="22"/>
+        </w:rPr>
+        <w:t xml:space="preserve"> and </w:t>
+      </w:r>
+      <m:oMath>
+        <m:sSub>
+          <m:e>
+            <m:r>
+              <m:rPr>
+                <m:sty m:val="i"/>
+              </m:rPr>
+              <m:t xml:space="preserve">t</m:t>
+            </m:r>
+          </m:e>
+          <m:sub>
+            <m:r>
+              <m:rPr>
+                <m:sty m:val="i"/>
+              </m:rPr>
+              <m:t xml:space="preserve">up</m:t>
+            </m:r>
+          </m:sub>
+        </m:sSub>
+      </m:oMath>
+      <w:r>
+        <w:rPr>
+          <w:color w:val="222222"/>
+          <w:sz w:val="22"/>
+        </w:rPr>
+        <w:t xml:space="preserve"> only:</w:t>
       </w:r>
     </w:p>
     <w:p>
@@ -7686,7 +8238,7 @@
       </w:tblPr>
       <w:tblGrid>
         <w:gridCol w:w="500"/>
-        <w:gridCol w:w="4160"/>
+        <w:gridCol w:w="3250"/>
       </w:tblGrid>
       <w:tr>
         <w:tc>
@@ -7728,12 +8280,24 @@
               </m:r>
               <m:sSup>
                 <m:e>
-                  <m:r>
-                    <m:rPr>
-                      <m:sty m:val="p"/>
-                    </m:rPr>
-                    <m:t xml:space="preserve">(17.7)</m:t>
-                  </m:r>
+                  <m:sSub>
+                    <m:e>
+                      <m:r>
+                        <m:rPr>
+                          <m:sty m:val="i"/>
+                        </m:rPr>
+                        <m:t xml:space="preserve">v</m:t>
+                      </m:r>
+                    </m:e>
+                    <m:sub>
+                      <m:r>
+                        <m:rPr>
+                          <m:sty m:val="p"/>
+                        </m:rPr>
+                        <m:t xml:space="preserve">0</m:t>
+                      </m:r>
+                    </m:sub>
+                  </m:sSub>
                 </m:e>
                 <m:sup>
                   <m:r>
@@ -7748,19 +8312,13 @@
                 <m:rPr>
                   <m:sty m:val="p"/>
                 </m:rPr>
-                <m:t xml:space="preserve"> + 2(−9.81)(</m:t>
+                <m:t xml:space="preserve"> + 2</m:t>
               </m:r>
               <m:r>
                 <m:rPr>
                   <m:sty m:val="i"/>
                 </m:rPr>
-                <m:t xml:space="preserve">h</m:t>
-              </m:r>
-              <m:r>
-                <m:rPr>
-                  <m:sty m:val="p"/>
-                </m:rPr>
-                <m:t xml:space="preserve">)</m:t>
+                <m:t xml:space="preserve">ah</m:t>
               </m:r>
             </m:oMath>
           </w:p>
@@ -7809,14 +8367,32 @@
                   <m:type m:val="bar"/>
                 </m:fPr>
                 <m:num>
+                  <m:r>
+                    <m:rPr>
+                      <m:sty m:val="p"/>
+                    </m:rPr>
+                    <m:t xml:space="preserve">−</m:t>
+                  </m:r>
                   <m:sSup>
                     <m:e>
-                      <m:r>
-                        <m:rPr>
-                          <m:sty m:val="p"/>
-                        </m:rPr>
-                        <m:t xml:space="preserve">(17.7)</m:t>
-                      </m:r>
+                      <m:sSub>
+                        <m:e>
+                          <m:r>
+                            <m:rPr>
+                              <m:sty m:val="i"/>
+                            </m:rPr>
+                            <m:t xml:space="preserve">v</m:t>
+                          </m:r>
+                        </m:e>
+                        <m:sub>
+                          <m:r>
+                            <m:rPr>
+                              <m:sty m:val="p"/>
+                            </m:rPr>
+                            <m:t xml:space="preserve">0</m:t>
+                          </m:r>
+                        </m:sub>
+                      </m:sSub>
                     </m:e>
                     <m:sup>
                       <m:r>
@@ -7833,7 +8409,13 @@
                     <m:rPr>
                       <m:sty m:val="p"/>
                     </m:rPr>
-                    <m:t xml:space="preserve">2 × 9.81</m:t>
+                    <m:t xml:space="preserve">2</m:t>
+                  </m:r>
+                  <m:r>
+                    <m:rPr>
+                      <m:sty m:val="i"/>
+                    </m:rPr>
+                    <m:t xml:space="preserve">a</m:t>
                   </m:r>
                 </m:den>
               </m:f>
@@ -7841,7 +8423,7 @@
                 <m:rPr>
                   <m:sty m:val="p"/>
                 </m:rPr>
-                <m:t xml:space="preserve"> = </m:t>
+                <m:t xml:space="preserve"> = −</m:t>
               </m:r>
               <m:f>
                 <m:fPr>
@@ -7852,7 +8434,7 @@
                     <m:rPr>
                       <m:sty m:val="p"/>
                     </m:rPr>
-                    <m:t xml:space="preserve">311.8</m:t>
+                    <m:t xml:space="preserve">1</m:t>
                   </m:r>
                 </m:num>
                 <m:den>
@@ -7860,14 +8442,139 @@
                     <m:rPr>
                       <m:sty m:val="p"/>
                     </m:rPr>
-                    <m:t xml:space="preserve">19.62</m:t>
+                    <m:t xml:space="preserve">2</m:t>
                   </m:r>
                 </m:den>
               </m:f>
+              <m:r>
+                <m:rPr>
+                  <m:sty m:val="i"/>
+                </m:rPr>
+                <m:t xml:space="preserve">a</m:t>
+              </m:r>
+              <m:sSup>
+                <m:e>
+                  <m:sSub>
+                    <m:e>
+                      <m:r>
+                        <m:rPr>
+                          <m:sty m:val="i"/>
+                        </m:rPr>
+                        <m:t xml:space="preserve">t</m:t>
+                      </m:r>
+                    </m:e>
+                    <m:sub>
+                      <m:r>
+                        <m:rPr>
+                          <m:sty m:val="i"/>
+                        </m:rPr>
+                        <m:t xml:space="preserve">up</m:t>
+                      </m:r>
+                    </m:sub>
+                  </m:sSub>
+                </m:e>
+                <m:sup>
+                  <m:r>
+                    <m:rPr>
+                      <m:sty m:val="p"/>
+                    </m:rPr>
+                    <m:t xml:space="preserve">2</m:t>
+                  </m:r>
+                </m:sup>
+              </m:sSup>
             </m:oMath>
           </w:p>
         </w:tc>
       </w:tr>
+    </w:tbl>
+    <w:p>
+      <w:pPr>
+        <w:spacing w:before="0" w:after="0" w:line="40" w:lineRule="exact"/>
+      </w:pPr>
+    </w:p>
+    <w:p>
+      <w:pPr>
+        <w:spacing w:before="40" w:after="30"/>
+      </w:pPr>
+      <w:r>
+        <w:rPr>
+          <w:color w:val="222222"/>
+          <w:sz w:val="22"/>
+        </w:rPr>
+        <w:t xml:space="preserve">Substitute </w:t>
+      </w:r>
+      <m:oMath>
+        <m:r>
+          <m:rPr>
+            <m:sty m:val="i"/>
+          </m:rPr>
+          <m:t xml:space="preserve">a</m:t>
+        </m:r>
+      </m:oMath>
+      <w:r>
+        <w:rPr>
+          <w:color w:val="222222"/>
+          <w:sz w:val="22"/>
+        </w:rPr>
+        <w:t xml:space="preserve"> = −9.81 m/s² and </w:t>
+      </w:r>
+      <m:oMath>
+        <m:sSub>
+          <m:e>
+            <m:r>
+              <m:rPr>
+                <m:sty m:val="i"/>
+              </m:rPr>
+              <m:t xml:space="preserve">t</m:t>
+            </m:r>
+          </m:e>
+          <m:sub>
+            <m:r>
+              <m:rPr>
+                <m:sty m:val="i"/>
+              </m:rPr>
+              <m:t xml:space="preserve">up</m:t>
+            </m:r>
+          </m:sub>
+        </m:sSub>
+      </m:oMath>
+      <w:r>
+        <w:rPr>
+          <w:color w:val="222222"/>
+          <w:sz w:val="22"/>
+        </w:rPr>
+        <w:t xml:space="preserve"> = 1.80 s:</w:t>
+      </w:r>
+    </w:p>
+    <w:p>
+      <w:pPr>
+        <w:spacing w:before="0" w:after="0" w:line="40" w:lineRule="exact"/>
+      </w:pPr>
+    </w:p>
+    <w:tbl>
+      <w:tblPr>
+        <w:tblW w:w="0" w:type="auto"/>
+        <w:tblInd w:w="650" w:type="dxa"/>
+        <w:tblBorders>
+          <w:top w:val="none" w:sz="0" w:space="0"/>
+          <w:left w:val="none" w:sz="0" w:space="0"/>
+          <w:bottom w:val="none" w:sz="0" w:space="0"/>
+          <w:right w:val="none" w:sz="0" w:space="0"/>
+          <w:insideH w:val="none" w:sz="0" w:space="0"/>
+          <w:insideV w:val="none" w:sz="0" w:space="0"/>
+        </w:tblBorders>
+        <w:tblLayout w:type="fixed"/>
+        <w:tblCellMar>
+          <w:top w:w="10" w:type="dxa"/>
+          <w:bottom w:w="10" w:type="dxa"/>
+          <w:left w:w="40" w:type="dxa"/>
+          <w:right w:w="40" w:type="dxa"/>
+        </w:tblCellMar>
+      </w:tblPr>
+      <w:tblGrid>
+        <w:gridCol w:w="500"/>
+        <w:gridCol w:w="2600"/>
+      </w:tblGrid>
       <w:tr>
         <w:tc>
           <w:tcPr>
@@ -7904,14 +8611,53 @@
                 <m:rPr>
                   <m:sty m:val="p"/>
                 </m:rPr>
-                <m:t xml:space="preserve">= 15.9 </m:t>
-              </m:r>
+                <m:t xml:space="preserve">= −</m:t>
+              </m:r>
+              <m:f>
+                <m:fPr>
+                  <m:type m:val="bar"/>
+                </m:fPr>
+                <m:num>
+                  <m:r>
+                    <m:rPr>
+                      <m:sty m:val="p"/>
+                    </m:rPr>
+                    <m:t xml:space="preserve">1</m:t>
+                  </m:r>
+                </m:num>
+                <m:den>
+                  <m:r>
+                    <m:rPr>
+                      <m:sty m:val="p"/>
+                    </m:rPr>
+                    <m:t xml:space="preserve">2</m:t>
+                  </m:r>
+                </m:den>
+              </m:f>
               <m:r>
                 <m:rPr>
                   <m:sty m:val="p"/>
                 </m:rPr>
-                <m:t xml:space="preserve">m</m:t>
-              </m:r>
+                <m:t xml:space="preserve">(−9.81)</m:t>
+              </m:r>
+              <m:sSup>
+                <m:e>
+                  <m:r>
+                    <m:rPr>
+                      <m:sty m:val="p"/>
+                    </m:rPr>
+                    <m:t xml:space="preserve">(1.80)</m:t>
+                  </m:r>
+                </m:e>
+                <m:sup>
+                  <m:r>
+                    <m:rPr>
+                      <m:sty m:val="p"/>
+                    </m:rPr>
+                    <m:t xml:space="preserve">2</m:t>
+                  </m:r>
+                </m:sup>
+              </m:sSup>
             </m:oMath>
           </w:p>
         </w:tc>

</xml_diff>

<commit_message>
Round final answers to two decimal places
Updates the boxed final answers (and the tip text that quotes them) to
two decimal places in both the g = 9.80 and g = 9.81 documents:
- g=9.80: 17.69 m, 18.62 m/s, -23.03 m / -22.70 m/s, -14.86 m/s,
  4.44 m/s, 0.52 s, 15.88 m
- g=9.81: 17.71 m, 18.64 m/s, -23.04 m / -22.72 m/s, -14.86 m/s,
  4.43 m/s, 0.52 s, 15.89 m
Structure, style, and equation setup are unchanged.
</commit_message>
<xml_diff>
--- a/Guided-Examples-Free-Fall-g9.81.docx
+++ b/Guided-Examples-Free-Fall-g9.81.docx
@@ -1239,7 +1239,7 @@
                 <w:color w:val="222222"/>
                 <w:sz w:val="22"/>
               </w:rPr>
-              <w:t xml:space="preserve">Since “height” is a distance (always positive), we report the size of the number, 17.7 m, and drop the minus sign.</w:t>
+              <w:t xml:space="preserve">Since “height” is a distance (always positive), we report the size of the number, 17.71 m, and drop the minus sign.</w:t>
             </w:r>
           </w:p>
         </w:tc>
@@ -1328,7 +1328,7 @@
             </w:tblPr>
             <w:tblGrid>
               <w:gridCol w:w="980"/>
-              <w:gridCol w:w="1300"/>
+              <w:gridCol w:w="1430"/>
             </w:tblGrid>
             <w:tr>
               <w:tc>
@@ -1366,7 +1366,7 @@
                       <m:rPr>
                         <m:sty m:val="b"/>
                       </m:rPr>
-                      <m:t xml:space="preserve">= 17.7 </m:t>
+                      <m:t xml:space="preserve">= 17.71 </m:t>
                     </m:r>
                     <m:r>
                       <m:rPr>
@@ -1892,7 +1892,7 @@
             </w:tblPr>
             <w:tblGrid>
               <w:gridCol w:w="590"/>
-              <w:gridCol w:w="1560"/>
+              <w:gridCol w:w="1690"/>
             </w:tblGrid>
             <w:tr>
               <w:tc>
@@ -1942,7 +1942,7 @@
                       <m:rPr>
                         <m:sty m:val="b"/>
                       </m:rPr>
-                      <m:t xml:space="preserve">= 18.6 </m:t>
+                      <m:t xml:space="preserve">= 18.64 </m:t>
                     </m:r>
                     <m:r>
                       <m:rPr>
@@ -3232,7 +3232,7 @@
             </w:tblPr>
             <w:tblGrid>
               <w:gridCol w:w="500"/>
-              <w:gridCol w:w="1690"/>
+              <w:gridCol w:w="1820"/>
             </w:tblGrid>
             <w:tr>
               <w:tc>
@@ -3270,7 +3270,7 @@
                       <m:rPr>
                         <m:sty m:val="b"/>
                       </m:rPr>
-                      <m:t xml:space="preserve">= −23.0 </m:t>
+                      <m:t xml:space="preserve">= −23.04 </m:t>
                     </m:r>
                     <m:r>
                       <m:rPr>
@@ -3318,7 +3318,7 @@
                       <m:rPr>
                         <m:sty m:val="b"/>
                       </m:rPr>
-                      <m:t xml:space="preserve">= −22.7 </m:t>
+                      <m:t xml:space="preserve">= −22.72 </m:t>
                     </m:r>
                     <m:r>
                       <m:rPr>
@@ -3951,7 +3951,7 @@
                 <w:color w:val="222222"/>
                 <w:sz w:val="22"/>
               </w:rPr>
-              <w:t xml:space="preserve">Physically the stone was thrown downward and gravity only speeds it up, so it never reverses — the velocity stays negative: v = −14.9 m/s.</w:t>
+              <w:t xml:space="preserve">Physically the stone was thrown downward and gravity only speeds it up, so it never reverses — the velocity stays negative: v = −14.86 m/s.</w:t>
             </w:r>
           </w:p>
         </w:tc>
@@ -4040,7 +4040,7 @@
             </w:tblPr>
             <w:tblGrid>
               <w:gridCol w:w="500"/>
-              <w:gridCol w:w="1690"/>
+              <w:gridCol w:w="1820"/>
             </w:tblGrid>
             <w:tr>
               <w:tc>
@@ -4078,7 +4078,7 @@
                       <m:rPr>
                         <m:sty m:val="b"/>
                       </m:rPr>
-                      <m:t xml:space="preserve">= −14.9 </m:t>
+                      <m:t xml:space="preserve">= −14.86 </m:t>
                     </m:r>
                     <m:r>
                       <m:rPr>
@@ -6347,7 +6347,7 @@
       </w:tblPr>
       <w:tblGrid>
         <w:gridCol w:w="500"/>
-        <w:gridCol w:w="4290"/>
+        <w:gridCol w:w="4160"/>
       </w:tblGrid>
       <w:tr>
         <w:tc>
@@ -6385,7 +6385,7 @@
                 <m:rPr>
                   <m:sty m:val="p"/>
                 </m:rPr>
-                <m:t xml:space="preserve">= 0.517 </m:t>
+                <m:t xml:space="preserve">= 0.52 </m:t>
               </m:r>
               <m:r>
                 <m:rPr>
@@ -6506,7 +6506,7 @@
                 <w:color w:val="222222"/>
                 <w:sz w:val="22"/>
               </w:rPr>
-              <w:t xml:space="preserve">t = 0.517 s is the rising pass and t = 1.42 s the falling pass, but the putty sticks on arrival — so only the smaller time is physical.</w:t>
+              <w:t xml:space="preserve">t = 0.52 s is the rising pass and t = 1.42 s the falling pass, but the putty sticks on arrival — so only the smaller time is physical.</w:t>
             </w:r>
           </w:p>
         </w:tc>
@@ -6595,7 +6595,7 @@
             </w:tblPr>
             <w:tblGrid>
               <w:gridCol w:w="500"/>
-              <w:gridCol w:w="1430"/>
+              <w:gridCol w:w="1300"/>
             </w:tblGrid>
             <w:tr>
               <w:tc>
@@ -6633,7 +6633,7 @@
                       <m:rPr>
                         <m:sty m:val="b"/>
                       </m:rPr>
-                      <m:t xml:space="preserve">= 0.517 </m:t>
+                      <m:t xml:space="preserve">= 0.52 </m:t>
                     </m:r>
                     <m:r>
                       <m:rPr>
@@ -8736,7 +8736,7 @@
             </w:tblPr>
             <w:tblGrid>
               <w:gridCol w:w="2020"/>
-              <w:gridCol w:w="1300"/>
+              <w:gridCol w:w="1430"/>
             </w:tblGrid>
             <w:tr>
               <w:tc>
@@ -8774,7 +8774,7 @@
                       <m:rPr>
                         <m:sty m:val="b"/>
                       </m:rPr>
-                      <m:t xml:space="preserve">= 15.9 </m:t>
+                      <m:t xml:space="preserve">= 15.89 </m:t>
                     </m:r>
                     <m:r>
                       <m:rPr>

</xml_diff>